<commit_message>
feat(workflow): implement complete 5-step business review process per revision docx
</commit_message>
<xml_diff>
--- a/BaoCao_DieuChinh_NghiepVu_Revision_2026.docx
+++ b/BaoCao_DieuChinh_NghiepVu_Revision_2026.docx
@@ -1381,11 +1381,11 @@
         <w:rPr>
           <w:b/>
         </w:rPr>
-        <w:t>3.3. Quy trình Kiểm tra Tính Hợp lệ &amp; Thẩm định (hoso_detail.html &amp; app.py)</w:t>
+        <w:t>3.3. Quy trình 5 Bước Kiểm tra Tính Hợp lệ &amp; Thẩm định (hoso_detail.html &amp; app.py)</w:t>
         <w:br/>
       </w:r>
       <w:r>
-        <w:t>Phân hệ thẩm định của Cán bộ xét duyệt và Quản trị viên được hoàn thiện với đầy đủ 3 nhánh quyết định chuẩn:</w:t>
+        <w:t>Quy trình thẩm định kiểm tra tính hợp lệ công trình KH&amp;CN đã hoàn thành/công bố được chuẩn hóa trọn vẹn theo 5 bước nghiệp vụ của tài liệu Revision:</w:t>
       </w:r>
     </w:p>
     <w:p>
@@ -1396,10 +1396,10 @@
         <w:rPr>
           <w:b/>
         </w:rPr>
-        <w:t xml:space="preserve">Phê duyệt (Đã duyệt): </w:t>
+        <w:t xml:space="preserve">Bước 1: Tiếp nhận &amp; Tự động chuyển trạng thái (Bước 1c): </w:t>
       </w:r>
       <w:r>
-        <w:t>Công nhận công trình hợp lệ, hồ sơ đạt chuẩn, khóa quyền chỉnh sửa.</w:t>
+        <w:t>Hàng đợi xét duyệt được tự động sắp xếp ưu tiên theo Điểm rủi ro AI (Risk score giảm dần). Khi Cán bộ xét duyệt (TS. Lê Thanh Phong) hoặc Admin mở xem chi tiết một hồ sơ đang ở trạng thái 'Chờ xét duyệt', hệ thống tự động chuyển trạng thái sang 'Đang xét duyệt' và ghi nhận cán bộ phụ trách vào LichSuXetDuyet để tránh trùng lặp xử lý giữa các cán bộ.</w:t>
       </w:r>
     </w:p>
     <w:p>
@@ -1410,10 +1410,10 @@
         <w:rPr>
           <w:b/>
         </w:rPr>
-        <w:t xml:space="preserve">Yêu cầu bổ sung: </w:t>
+        <w:t xml:space="preserve">Bước 2: Thẩm định &amp; Nhập ý kiến đánh giá: </w:t>
       </w:r>
       <w:r>
-        <w:t>Cán bộ nhập chi tiết nội dung cần chỉnh sửa hoặc minh chứng thiếu. Hệ thống mở lại quyền cho tác giả bấm nút 'Chỉnh sửa Hồ sơ' để cập nhật lại.</w:t>
+        <w:t>Cán bộ đối chiếu minh chứng thực tế với gợi ý từ Mô-đun AI PhoBERT &amp; TF-IDF+SVM (Khung 1), kiểm tra các dấu hiệu cảnh báo tạp chí rác hoặc trùng lặp từ Đồ thị NetworkX &amp; Isolation Forest (Khung 2), và nhập ý kiến nhận xét chuyên môn.</w:t>
       </w:r>
     </w:p>
     <w:p>
@@ -1424,10 +1424,38 @@
         <w:rPr>
           <w:b/>
         </w:rPr>
-        <w:t xml:space="preserve">Từ chối: </w:t>
+        <w:t xml:space="preserve">Bước 3: Ra quyết định xét duyệt qua 3 nhánh: </w:t>
       </w:r>
       <w:r>
-        <w:t>Không công nhận công trình vi phạm hoặc không đạt yêu cầu. Bắt buộc nhập lý do từ chối vào biên bản.</w:t>
+        <w:t>Cán bộ chọn: (1) 'Đã duyệt' - Công nhận công trình hợp lệ; (2) 'Từ chối' - Bắt buộc nhập chi tiết lý do từ chối (tối thiểu 5 ký tự); (3) 'Yêu cầu bổ sung' - Bắt buộc ghi rõ nội dung cần chỉnh sửa/minh chứng cần bổ sung.</w:t>
+      </w:r>
+    </w:p>
+    <w:p>
+      <w:pPr>
+        <w:pStyle w:val="ListBullet"/>
+      </w:pPr>
+      <w:r>
+        <w:rPr>
+          <w:b/>
+        </w:rPr>
+        <w:t xml:space="preserve">Bước 4: Ghi nhận Lịch sử xét duyệt bất biến: </w:t>
+      </w:r>
+      <w:r>
+        <w:t>Mọi lần chuyển đổi trạng thái đều được tự động lưu vết vào bảng LichSuXetDuyet (thời gian, tài khoản thực hiện, trạng thái cũ/mới, ý kiến thẩm định). Bảng này được thiết kế bất biến (Read-only), không cho phép sửa xóa để phục vụ công tác thanh tra.</w:t>
+      </w:r>
+    </w:p>
+    <w:p>
+      <w:pPr>
+        <w:pStyle w:val="ListBullet"/>
+      </w:pPr>
+      <w:r>
+        <w:rPr>
+          <w:b/>
+        </w:rPr>
+        <w:t xml:space="preserve">Bước 5: Phản hồi thông báo &amp; Vòng lặp nộp lại (Resubmission loop): </w:t>
+      </w:r>
+      <w:r>
+        <w:t>Tác giả (TS. Nguyễn Thành Tài) khi đăng nhập sẽ thấy huy hiệu (badge) và thanh thông báo (banner) màu vàng nổi bật báo có hồ sơ cần bổ sung. Tác giả mở hồ sơ, chỉnh sửa thông tin/minh chứng và bấm 'Lưu thay đổi'. Khi lưu, hệ thống tự động chuyển trạng thái từ 'Yêu cầu bổ sung' về lại 'Chờ xét duyệt' kèm nhật ký để Cán bộ tái thẩm định.</w:t>
       </w:r>
     </w:p>
     <w:p>
@@ -1972,6 +2000,90 @@
           </w:p>
         </w:tc>
       </w:tr>
+      <w:tr>
+        <w:tc>
+          <w:tcPr>
+            <w:tcW w:type="dxa" w:w="3216"/>
+            <w:shd w:fill="FFFFFF"/>
+            <w:tcMar>
+              <w:top w:w="120" w:type="dxa"/>
+              <w:bottom w:w="120" w:type="dxa"/>
+              <w:left w:w="150" w:type="dxa"/>
+              <w:right w:w="150" w:type="dxa"/>
+            </w:tcMar>
+            <w:vAlign w:val="center"/>
+          </w:tcPr>
+          <w:p>
+            <w:pPr>
+              <w:spacing w:line="288" w:lineRule="auto" w:after="40" w:before="40"/>
+              <w:jc w:val="left"/>
+            </w:pPr>
+            <w:r>
+              <w:rPr>
+                <w:rFonts w:ascii="Times New Roman" w:hAnsi="Times New Roman"/>
+                <w:b w:val="0"/>
+                <w:sz w:val="20"/>
+              </w:rPr>
+              <w:t>6. Quy trình &amp; Luồng 5 bước</w:t>
+            </w:r>
+          </w:p>
+        </w:tc>
+        <w:tc>
+          <w:tcPr>
+            <w:tcW w:type="dxa" w:w="3216"/>
+            <w:shd w:fill="FFFFFF"/>
+            <w:tcMar>
+              <w:top w:w="120" w:type="dxa"/>
+              <w:bottom w:w="120" w:type="dxa"/>
+              <w:left w:w="150" w:type="dxa"/>
+              <w:right w:w="150" w:type="dxa"/>
+            </w:tcMar>
+            <w:vAlign w:val="center"/>
+          </w:tcPr>
+          <w:p>
+            <w:pPr>
+              <w:spacing w:line="288" w:lineRule="auto" w:after="40" w:before="40"/>
+              <w:jc w:val="left"/>
+            </w:pPr>
+            <w:r>
+              <w:rPr>
+                <w:rFonts w:ascii="Times New Roman" w:hAnsi="Times New Roman"/>
+                <w:b w:val="0"/>
+                <w:sz w:val="20"/>
+              </w:rPr>
+              <w:t>Bước 1c tự động sang Đang xét duyệt; Quyết định Yêu cầu bổ sung; Vòng lặp nộp lại của Tác giả tự chuyển về Chờ xét duyệt.</w:t>
+            </w:r>
+          </w:p>
+        </w:tc>
+        <w:tc>
+          <w:tcPr>
+            <w:tcW w:type="dxa" w:w="3216"/>
+            <w:shd w:fill="FFFFFF"/>
+            <w:tcMar>
+              <w:top w:w="120" w:type="dxa"/>
+              <w:bottom w:w="120" w:type="dxa"/>
+              <w:left w:w="150" w:type="dxa"/>
+              <w:right w:w="150" w:type="dxa"/>
+            </w:tcMar>
+            <w:vAlign w:val="center"/>
+          </w:tcPr>
+          <w:p>
+            <w:pPr>
+              <w:spacing w:line="288" w:lineRule="auto" w:after="40" w:before="40"/>
+              <w:jc w:val="left"/>
+            </w:pPr>
+            <w:r>
+              <w:rPr>
+                <w:rFonts w:ascii="Times New Roman" w:hAnsi="Times New Roman"/>
+                <w:b w:val="0"/>
+                <w:color w:val="2E8540"/>
+                <w:sz w:val="20"/>
+              </w:rPr>
+              <w:t>ĐẠT (100% - Khép kín quy trình)</w:t>
+            </w:r>
+          </w:p>
+        </w:tc>
+      </w:tr>
     </w:tbl>
     <w:p>
       <w:pPr>

</xml_diff>